<commit_message>
W 11-04: Chapter sponsor break inside B (after Butler County, before Lynda); OmniWatch stays after A; tease lines updated
Co-Authored-By: Claude Opus 5.5 <noreply@anthropic.com>
Claude-Session: https://claude.ai/code/session_01DKKidkeUDmopBGagqb23YG
</commit_message>
<xml_diff>
--- a/runs/W_11042026/11_04 LIVE BIBLE -- SOURCE LOG.docx
+++ b/runs/W_11042026/11_04 LIVE BIBLE -- SOURCE LOG.docx
@@ -4119,6 +4119,16 @@
         <w:t>**Graphic 001** (B protection list): image prompt in the chat reply.</w:t>
       </w:r>
     </w:p>
+    <w:p>
+      <w:r>
+        <w:rPr>
+          <w:rFonts w:ascii="Arial" w:hAnsi="Arial" w:eastAsia="Arial"/>
+          <w:b w:val="0"/>
+          <w:sz w:val="20"/>
+        </w:rPr>
+        <w:t>**Chapter (added 10/28):** second sponsor, inside B after the Butler County case (Anderson) and before Lynda. OmniWatch stays first, after A. Chapter talking points and any read-verbatim lines still to come; red cue in copy.</w:t>
+      </w:r>
+    </w:p>
     <w:sectPr>
       <w:pgSz w:w="15840" w:h="12240" w:orient="landscape"/>
       <w:pgMar w:top="864" w:right="864" w:bottom="864" w:left="864" w:header="720" w:footer="720" w:gutter="0"/>

</xml_diff>

<commit_message>
W 11-04: clip 7 (Lori) verified on More Perfect Union's YouTube copy: four slices timed, HORIZONTAL; she wrote to the Oklahoma AG, started 2022
Co-Authored-By: Claude Opus 5.5 <noreply@anthropic.com>
Claude-Session: https://claude.ai/code/session_01DKKidkeUDmopBGagqb23YG
</commit_message>
<xml_diff>
--- a/runs/W_11042026/11_04 LIVE BIBLE -- SOURCE LOG.docx
+++ b/runs/W_11042026/11_04 LIVE BIBLE -- SOURCE LOG.docx
@@ -854,7 +854,7 @@
                 <w:b w:val="0"/>
                 <w:sz w:val="20"/>
               </w:rPr>
-              <w:t>Lori, Oklahoma: kitty litter $8.95 tag, $10 register; $10 gift card</w:t>
+              <w:t>Lori, Oklahoma: kitty litter $8.95 tag, $10 register; wrote to the Oklahoma AG; Dollar General offered a $10 gift card</w:t>
             </w:r>
           </w:p>
         </w:tc>
@@ -887,7 +887,7 @@
                 <w:b w:val="0"/>
                 <w:sz w:val="20"/>
               </w:rPr>
-              <w:t>More Perfect Union video transcript and Substack (per review, 10/28); show plan</w:t>
+              <w:t>More Perfect Union YouTube captions uE5THiD-kTk 1:38–3:25</w:t>
             </w:r>
           </w:p>
         </w:tc>
@@ -903,7 +903,7 @@
                 <w:b w:val="0"/>
                 <w:sz w:val="20"/>
               </w:rPr>
-              <w:t>Overcharges are from her 2023 complaint; video March 2024. Clip in/out still unverified (TikTok)</w:t>
+              <w:t>Began May 2022 (narration 1:38); video March 2024. Said as "back in 2022"</w:t>
             </w:r>
           </w:p>
         </w:tc>
@@ -1775,73 +1775,6 @@
                 <w:sz w:val="20"/>
               </w:rPr>
               <w:t>Yahoo/AT&amp;T (Nov 2023) quotes Pearlman; the clip itself is unverified (TikTok)</w:t>
-            </w:r>
-          </w:p>
-        </w:tc>
-      </w:tr>
-      <w:tr>
-        <w:tc>
-          <w:tcPr>
-            <w:tcW w:type="dxa" w:w="3528"/>
-          </w:tcPr>
-          <w:p>
-            <w:r/>
-            <w:r>
-              <w:rPr>
-                <w:rFonts w:ascii="Arial" w:hAnsi="Arial" w:eastAsia="Arial"/>
-                <w:b w:val="0"/>
-                <w:sz w:val="20"/>
-              </w:rPr>
-              <w:t>Lori's quotes and the four in/out points</w:t>
-            </w:r>
-          </w:p>
-        </w:tc>
-        <w:tc>
-          <w:tcPr>
-            <w:tcW w:type="dxa" w:w="3528"/>
-          </w:tcPr>
-          <w:p>
-            <w:r/>
-            <w:r>
-              <w:rPr>
-                <w:rFonts w:ascii="Arial" w:hAnsi="Arial" w:eastAsia="Arial"/>
-                <w:b/>
-                <w:color w:val="B26B00"/>
-                <w:sz w:val="20"/>
-              </w:rPr>
-              <w:t>UNVERIFIED</w:t>
-            </w:r>
-          </w:p>
-        </w:tc>
-        <w:tc>
-          <w:tcPr>
-            <w:tcW w:type="dxa" w:w="3528"/>
-          </w:tcPr>
-          <w:p>
-            <w:r/>
-            <w:r>
-              <w:rPr>
-                <w:rFonts w:ascii="Arial" w:hAnsi="Arial" w:eastAsia="Arial"/>
-                <w:b w:val="0"/>
-                <w:sz w:val="20"/>
-              </w:rPr>
-              <w:t>Show plan / general practice</w:t>
-            </w:r>
-          </w:p>
-        </w:tc>
-        <w:tc>
-          <w:tcPr>
-            <w:tcW w:type="dxa" w:w="3528"/>
-          </w:tcPr>
-          <w:p>
-            <w:r/>
-            <w:r>
-              <w:rPr>
-                <w:rFonts w:ascii="Arial" w:hAnsi="Arial" w:eastAsia="Arial"/>
-                <w:b w:val="0"/>
-                <w:sz w:val="20"/>
-              </w:rPr>
-              <w:t>Pull the TikTok and check against Whisper</w:t>
             </w:r>
           </w:p>
         </w:tc>
@@ -3312,7 +3245,7 @@
                 <w:b w:val="0"/>
                 <w:sz w:val="20"/>
               </w:rPr>
-              <w:t>V</w:t>
+              <w:t>H</w:t>
             </w:r>
           </w:p>
         </w:tc>
@@ -3344,7 +3277,7 @@
                 <w:b w:val="0"/>
                 <w:sz w:val="20"/>
               </w:rPr>
-              <w:t>https://www.tiktok.com/@moreperfectunion/video/7350333548567596330</w:t>
+              <w:t>https://www.youtube.com/watch?v=uE5THiD-kTk</w:t>
             </w:r>
           </w:p>
         </w:tc>
@@ -3360,7 +3293,7 @@
                 <w:b w:val="0"/>
                 <w:sz w:val="20"/>
               </w:rPr>
-              <w:t>plan: 1:46–2:29 BUTT 2:31–2:49 BUTT 3:04–3:23 BUTT 8:18–8:34 (unchecked)</w:t>
+              <w:t>1:46–2:29 (WHAT THE PRICE SAYS ON THE SHELF) BUTT 2:32–2:49 (I KNOW IT'S JUST NOT ME) BUTT 3:03–3:25 (IT WAS INSULTING) BUTT 8:18–8:34 (WELL, I DO)</w:t>
             </w:r>
           </w:p>
         </w:tc>
@@ -3376,7 +3309,7 @@
                 <w:b w:val="0"/>
                 <w:sz w:val="20"/>
               </w:rPr>
-              <w:t>Show plan</w:t>
+              <w:t>Human caption track (producer-supplied YouTube copy, 10/28); TikTok 7350333548567596330 is the alternate</w:t>
             </w:r>
           </w:p>
         </w:tc>
@@ -3392,7 +3325,7 @@
                 <w:b w:val="0"/>
                 <w:sz w:val="20"/>
               </w:rPr>
-              <w:t>MANUAL · UNVERIFIED</w:t>
+              <w:t>PICK. Started May 2022; she wrote to the Oklahoma AG (transcript 2:49–3:25)</w:t>
             </w:r>
           </w:p>
         </w:tc>
@@ -3976,16 +3909,6 @@
           <w:b w:val="0"/>
           <w:sz w:val="20"/>
         </w:rPr>
-        <w:t>**Lori's quotes and the four in/out points** (UNVERIFIED): Pull the TikTok and check against Whisper</w:t>
-      </w:r>
-    </w:p>
-    <w:p>
-      <w:r>
-        <w:rPr>
-          <w:rFonts w:ascii="Arial" w:hAnsi="Arial" w:eastAsia="Arial"/>
-          <w:b w:val="0"/>
-          <w:sz w:val="20"/>
-        </w:rPr>
         <w:t>**Paige's $14.29 refund and in/out points** (UNVERIFIED): Pull the TikTok; get surname and permission</w:t>
       </w:r>
     </w:p>

</xml_diff>

<commit_message>
W 11-04: C rewritten to lead with the bundle's benefits (Walmart's Oct 20 list)
Co-Authored-By: Claude Opus 5.5 <noreply@anthropic.com>
Claude-Session: https://claude.ai/code/session_01DKKidkeUDmopBGagqb23YG
</commit_message>
<xml_diff>
--- a/runs/W_11042026/11_04 LIVE BIBLE -- SOURCE LOG.docx
+++ b/runs/W_11042026/11_04 LIVE BIBLE -- SOURCE LOG.docx
@@ -1373,6 +1373,73 @@
                 <w:sz w:val="20"/>
               </w:rPr>
               <w:t>YouTube copy may be ±1 s</w:t>
+            </w:r>
+          </w:p>
+        </w:tc>
+      </w:tr>
+      <w:tr>
+        <w:tc>
+          <w:tcPr>
+            <w:tcW w:type="dxa" w:w="3528"/>
+          </w:tcPr>
+          <w:p>
+            <w:r/>
+            <w:r>
+              <w:rPr>
+                <w:rFonts w:ascii="Arial" w:hAnsi="Arial" w:eastAsia="Arial"/>
+                <w:b w:val="0"/>
+                <w:sz w:val="20"/>
+              </w:rPr>
+              <w:t>Bundle benefits: free delivery from Walmart and Sam's Club; Peacock or Paramount+; 10 cents a gallon at 17,000+ participating stations; Sam's Club access; 2% Sam's Cash on eligible purchases</w:t>
+            </w:r>
+          </w:p>
+        </w:tc>
+        <w:tc>
+          <w:tcPr>
+            <w:tcW w:type="dxa" w:w="3528"/>
+          </w:tcPr>
+          <w:p>
+            <w:r/>
+            <w:r>
+              <w:rPr>
+                <w:rFonts w:ascii="Arial" w:hAnsi="Arial" w:eastAsia="Arial"/>
+                <w:b/>
+                <w:color w:val="1E7B34"/>
+                <w:sz w:val="20"/>
+              </w:rPr>
+              <w:t>CONFIRMED</w:t>
+            </w:r>
+          </w:p>
+        </w:tc>
+        <w:tc>
+          <w:tcPr>
+            <w:tcW w:type="dxa" w:w="3528"/>
+          </w:tcPr>
+          <w:p>
+            <w:r/>
+            <w:r>
+              <w:rPr>
+                <w:rFonts w:ascii="Arial" w:hAnsi="Arial" w:eastAsia="Arial"/>
+                <w:b w:val="0"/>
+                <w:sz w:val="20"/>
+              </w:rPr>
+              <w:t>corporate.walmart.com, Oct 20, 2026</w:t>
+            </w:r>
+          </w:p>
+        </w:tc>
+        <w:tc>
+          <w:tcPr>
+            <w:tcW w:type="dxa" w:w="3528"/>
+          </w:tcPr>
+          <w:p>
+            <w:r/>
+            <w:r>
+              <w:rPr>
+                <w:rFonts w:ascii="Arial" w:hAnsi="Arial" w:eastAsia="Arial"/>
+                <w:b w:val="0"/>
+                <w:sz w:val="20"/>
+              </w:rPr>
+              <w:t>Walmart's own list, with footnoted terms; read the footnotes before air</w:t>
             </w:r>
           </w:p>
         </w:tc>

</xml_diff>